<commit_message>
Units 01a + 01b: skeleton, security headers, logger, isolation rules
</commit_message>
<xml_diff>
--- a/Computer-Operator-AI-Build-Guide.docx
+++ b/Computer-Operator-AI-Build-Guide.docx
@@ -10858,7 +10858,64 @@
           <w:sz w:val="18"/>
           <w:szCs w:val="18"/>
         </w:rPr>
-        <w:t xml:space="preserve">evidence for each — actual output, not a summary. Then run typecheck, lint,</w:t>
+        <w:t xml:space="preserve">evidence for each — actual output, not a summary.</w:t>
+      </w:r>
+    </w:p>
+    <w:p>
+      <w:pPr>
+        <w:pBdr>
+          <w:left w:val="single" w:color="006A4E" w:sz="18" w:space="8"/>
+        </w:pBdr>
+        <w:shd w:fill="EAF3EF" w:val="clear"/>
+        <w:spacing w:after="0" w:before="0" w:line="260"/>
+        <w:ind w:left="180" w:right="180"/>
+      </w:pPr>
+      <w:r>
+        <w:rPr>
+          <w:rFonts w:ascii="Consolas" w:cs="Consolas" w:eastAsia="Consolas" w:hAnsi="Consolas"/>
+          <w:color w:val="1A1A1A"/>
+          <w:sz w:val="18"/>
+          <w:szCs w:val="18"/>
+        </w:rPr>
+        <w:t xml:space="preserve"> </w:t>
+      </w:r>
+    </w:p>
+    <w:p>
+      <w:pPr>
+        <w:pBdr>
+          <w:left w:val="single" w:color="006A4E" w:sz="18" w:space="8"/>
+        </w:pBdr>
+        <w:shd w:fill="EAF3EF" w:val="clear"/>
+        <w:spacing w:after="0" w:before="0" w:line="260"/>
+        <w:ind w:left="180" w:right="180"/>
+      </w:pPr>
+      <w:r>
+        <w:rPr>
+          <w:rFonts w:ascii="Consolas" w:cs="Consolas" w:eastAsia="Consolas" w:hAnsi="Consolas"/>
+          <w:color w:val="1A1A1A"/>
+          <w:sz w:val="18"/>
+          <w:szCs w:val="18"/>
+        </w:rPr>
+        <w:t xml:space="preserve">Then run every check this project currently has set up and show the real</w:t>
+      </w:r>
+    </w:p>
+    <w:p>
+      <w:pPr>
+        <w:pBdr>
+          <w:left w:val="single" w:color="006A4E" w:sz="18" w:space="8"/>
+        </w:pBdr>
+        <w:shd w:fill="EAF3EF" w:val="clear"/>
+        <w:spacing w:after="0" w:before="0" w:line="260"/>
+        <w:ind w:left="180" w:right="180"/>
+      </w:pPr>
+      <w:r>
+        <w:rPr>
+          <w:rFonts w:ascii="Consolas" w:cs="Consolas" w:eastAsia="Consolas" w:hAnsi="Consolas"/>
+          <w:color w:val="1A1A1A"/>
+          <w:sz w:val="18"/>
+          <w:szCs w:val="18"/>
+        </w:rPr>
+        <w:t xml:space="preserve">output. If a check does not exist yet because a later unit installs it, say</w:t>
       </w:r>
     </w:p>
     <w:p>
@@ -10878,7 +10935,7 @@
           <w:sz w:val="18"/>
           <w:szCs w:val="18"/>
         </w:rPr>
-        <w:t xml:space="preserve">and tests and show the real output.</w:t>
+        <w:t xml:space="preserve">so instead of running it.</w:t>
       </w:r>
     </w:p>
     <w:p>

</xml_diff>